<commit_message>
docs(BLOCO-3): o guia de testes chega às disciplinas pelo curso (PEND-018-3)
Disciplinas saiu do menu: o guia passa a dizer Cursos → o curso → aba Disciplinas, o menu com sete itens e as seis abas do curso. O .docx foi regerado pelo script de sempre e confere com o .md palavra a palavra.

Co-Authored-By: Claude Opus 5.5 <noreply@anthropic.com>
Claude-Session: https://claude.ai/code/session_01MD3GBaCjFj5U9HKH98W1Z1
</commit_message>
<xml_diff>
--- a/docs/testes/guia-de-testes.docx
+++ b/docs/testes/guia-de-testes.docx
@@ -484,15 +484,15 @@
     </w:p>
     <w:p>
       <w:r>
-        <w:t xml:space="preserve">O menu tem oito itens, nesta ordem:</w:t>
-      </w:r>
-    </w:p>
-    <w:p>
-      <w:r>
-        <w:rPr>
-          <w:b/>
-        </w:rPr>
-        <w:t xml:space="preserve">Início · Cursos · Turmas · Disciplinas · Instrutores · Cronograma · Atividades · Administração</w:t>
+        <w:t xml:space="preserve">O menu tem sete itens, nesta ordem:</w:t>
+      </w:r>
+    </w:p>
+    <w:p>
+      <w:r>
+        <w:rPr>
+          <w:b/>
+        </w:rPr>
+        <w:t xml:space="preserve">Início · Cursos · Turmas · Instrutores · Cronograma · Atividades · Administração</w:t>
       </w:r>
     </w:p>
     <w:p>
@@ -635,7 +635,7 @@
         <w:pStyle w:val="Heading2"/>
       </w:pPr>
       <w:r>
-        <w:t xml:space="preserve">Todos veem os oito itens do menu — e isso é de propósito</w:t>
+        <w:t xml:space="preserve">Todos veem os sete itens do menu — e isso é de propósito</w:t>
       </w:r>
     </w:p>
     <w:p>
@@ -1165,7 +1165,16 @@
         <w:spacing w:after="80"/>
       </w:pPr>
       <w:r>
-        <w:t xml:space="preserve">9.	Troque entre as abas </w:t>
+        <w:t xml:space="preserve">9.	Troque entre as abas da página do curso: </w:t>
+      </w:r>
+      <w:r>
+        <w:rPr>
+          <w:b/>
+        </w:rPr>
+        <w:t xml:space="preserve">Sobre o Curso</w:t>
+      </w:r>
+      <w:r>
+        <w:t xml:space="preserve">, </w:t>
       </w:r>
       <w:r>
         <w:rPr>
@@ -1174,13 +1183,40 @@
         <w:t xml:space="preserve">Grade</w:t>
       </w:r>
       <w:r>
+        <w:t xml:space="preserve">, </w:t>
+      </w:r>
+      <w:r>
+        <w:rPr>
+          <w:b/>
+        </w:rPr>
+        <w:t xml:space="preserve">Disciplinas</w:t>
+      </w:r>
+      <w:r>
+        <w:t xml:space="preserve">, </w:t>
+      </w:r>
+      <w:r>
+        <w:rPr>
+          <w:b/>
+        </w:rPr>
+        <w:t xml:space="preserve">Avaliações</w:t>
+      </w:r>
+      <w:r>
+        <w:t xml:space="preserve">, </w:t>
+      </w:r>
+      <w:r>
+        <w:rPr>
+          <w:b/>
+        </w:rPr>
+        <w:t xml:space="preserve">Atividades</w:t>
+      </w:r>
+      <w:r>
         <w:t xml:space="preserve"> e </w:t>
       </w:r>
       <w:r>
         <w:rPr>
           <w:b/>
         </w:rPr>
-        <w:t xml:space="preserve">Sobre o Curso</w:t>
+        <w:t xml:space="preserve">Horários</w:t>
       </w:r>
       <w:r>
         <w:t xml:space="preserve">.</w:t>
@@ -1478,7 +1514,16 @@
         <w:spacing w:after="80"/>
       </w:pPr>
       <w:r>
-        <w:t xml:space="preserve">19.	Clique em </w:t>
+        <w:t xml:space="preserve">19.	As disciplinas ficam </w:t>
+      </w:r>
+      <w:r>
+        <w:rPr>
+          <w:b/>
+        </w:rPr>
+        <w:t xml:space="preserve">dentro do curso</w:t>
+      </w:r>
+      <w:r>
+        <w:t xml:space="preserve"> (não há mais </w:t>
       </w:r>
       <w:r>
         <w:rPr>
@@ -1487,13 +1532,22 @@
         <w:t xml:space="preserve">Disciplinas</w:t>
       </w:r>
       <w:r>
-        <w:t xml:space="preserve"> e escolha um curso na lista </w:t>
-      </w:r>
-      <w:r>
-        <w:rPr>
-          <w:b/>
-        </w:rPr>
-        <w:t xml:space="preserve">Curso</w:t>
+        <w:t xml:space="preserve"> no menu): clique em </w:t>
+      </w:r>
+      <w:r>
+        <w:rPr>
+          <w:b/>
+        </w:rPr>
+        <w:t xml:space="preserve">Cursos</w:t>
+      </w:r>
+      <w:r>
+        <w:t xml:space="preserve">, abra um curso e clique na aba </w:t>
+      </w:r>
+      <w:r>
+        <w:rPr>
+          <w:b/>
+        </w:rPr>
+        <w:t xml:space="preserve">Disciplinas</w:t>
       </w:r>
       <w:r>
         <w:t xml:space="preserve">.</w:t>
@@ -2974,10 +3028,19 @@
         <w:rPr>
           <w:b/>
         </w:rPr>
+        <w:t xml:space="preserve">Cursos</w:t>
+      </w:r>
+      <w:r>
+        <w:t xml:space="preserve"> → um curso → aba </w:t>
+      </w:r>
+      <w:r>
+        <w:rPr>
+          <w:b/>
+        </w:rPr>
         <w:t xml:space="preserve">Disciplinas</w:t>
       </w:r>
       <w:r>
-        <w:t xml:space="preserve">, escolha um curso e abra uma linha.</w:t>
+        <w:t xml:space="preserve">, e abra uma linha.</w:t>
       </w:r>
     </w:p>
     <w:p>

</xml_diff>

<commit_message>
feat(BLOCO-3): a página do curso em seis abas e o regime nomeado da turma (#75)
Abas Sobre o Curso · Grade · Disciplinas · Avaliações · Atividades · Horários; Disciplinas saiu do menu e /disciplinas só redireciona; Avaliações e Atividades só com o previsto do currículo; regimes de horário nomeados por curso, escolhidos pela turma e usados no DSA, no alerta do excepcional, na cascata, no dia parado e no saldo. Migration 20261020025815 (só acrescenta), aplicada no remoto antes do merge. Aprovado por Bernardo Villas Boas em 20/10/2026.

Co-Authored-By: Claude Opus 5.5 <noreply@anthropic.com>
Claude-Session: https://claude.ai/code/session_01MD3GBaCjFj5U9HKH98W1Z1
</commit_message>
<xml_diff>
--- a/docs/testes/guia-de-testes.docx
+++ b/docs/testes/guia-de-testes.docx
@@ -484,15 +484,15 @@
     </w:p>
     <w:p>
       <w:r>
-        <w:t xml:space="preserve">O menu tem oito itens, nesta ordem:</w:t>
-      </w:r>
-    </w:p>
-    <w:p>
-      <w:r>
-        <w:rPr>
-          <w:b/>
-        </w:rPr>
-        <w:t xml:space="preserve">Início · Cursos · Turmas · Disciplinas · Instrutores · Cronograma · Atividades · Administração</w:t>
+        <w:t xml:space="preserve">O menu tem sete itens, nesta ordem:</w:t>
+      </w:r>
+    </w:p>
+    <w:p>
+      <w:r>
+        <w:rPr>
+          <w:b/>
+        </w:rPr>
+        <w:t xml:space="preserve">Início · Cursos · Turmas · Instrutores · Cronograma · Atividades · Administração</w:t>
       </w:r>
     </w:p>
     <w:p>
@@ -635,7 +635,7 @@
         <w:pStyle w:val="Heading2"/>
       </w:pPr>
       <w:r>
-        <w:t xml:space="preserve">Todos veem os oito itens do menu — e isso é de propósito</w:t>
+        <w:t xml:space="preserve">Todos veem os sete itens do menu — e isso é de propósito</w:t>
       </w:r>
     </w:p>
     <w:p>
@@ -1165,7 +1165,16 @@
         <w:spacing w:after="80"/>
       </w:pPr>
       <w:r>
-        <w:t xml:space="preserve">9.	Troque entre as abas </w:t>
+        <w:t xml:space="preserve">9.	Troque entre as abas da página do curso: </w:t>
+      </w:r>
+      <w:r>
+        <w:rPr>
+          <w:b/>
+        </w:rPr>
+        <w:t xml:space="preserve">Sobre o Curso</w:t>
+      </w:r>
+      <w:r>
+        <w:t xml:space="preserve">, </w:t>
       </w:r>
       <w:r>
         <w:rPr>
@@ -1174,13 +1183,40 @@
         <w:t xml:space="preserve">Grade</w:t>
       </w:r>
       <w:r>
+        <w:t xml:space="preserve">, </w:t>
+      </w:r>
+      <w:r>
+        <w:rPr>
+          <w:b/>
+        </w:rPr>
+        <w:t xml:space="preserve">Disciplinas</w:t>
+      </w:r>
+      <w:r>
+        <w:t xml:space="preserve">, </w:t>
+      </w:r>
+      <w:r>
+        <w:rPr>
+          <w:b/>
+        </w:rPr>
+        <w:t xml:space="preserve">Avaliações</w:t>
+      </w:r>
+      <w:r>
+        <w:t xml:space="preserve">, </w:t>
+      </w:r>
+      <w:r>
+        <w:rPr>
+          <w:b/>
+        </w:rPr>
+        <w:t xml:space="preserve">Atividades</w:t>
+      </w:r>
+      <w:r>
         <w:t xml:space="preserve"> e </w:t>
       </w:r>
       <w:r>
         <w:rPr>
           <w:b/>
         </w:rPr>
-        <w:t xml:space="preserve">Sobre o Curso</w:t>
+        <w:t xml:space="preserve">Horários</w:t>
       </w:r>
       <w:r>
         <w:t xml:space="preserve">.</w:t>
@@ -1478,7 +1514,16 @@
         <w:spacing w:after="80"/>
       </w:pPr>
       <w:r>
-        <w:t xml:space="preserve">19.	Clique em </w:t>
+        <w:t xml:space="preserve">19.	As disciplinas ficam </w:t>
+      </w:r>
+      <w:r>
+        <w:rPr>
+          <w:b/>
+        </w:rPr>
+        <w:t xml:space="preserve">dentro do curso</w:t>
+      </w:r>
+      <w:r>
+        <w:t xml:space="preserve"> (não há mais </w:t>
       </w:r>
       <w:r>
         <w:rPr>
@@ -1487,13 +1532,22 @@
         <w:t xml:space="preserve">Disciplinas</w:t>
       </w:r>
       <w:r>
-        <w:t xml:space="preserve"> e escolha um curso na lista </w:t>
-      </w:r>
-      <w:r>
-        <w:rPr>
-          <w:b/>
-        </w:rPr>
-        <w:t xml:space="preserve">Curso</w:t>
+        <w:t xml:space="preserve"> no menu): clique em </w:t>
+      </w:r>
+      <w:r>
+        <w:rPr>
+          <w:b/>
+        </w:rPr>
+        <w:t xml:space="preserve">Cursos</w:t>
+      </w:r>
+      <w:r>
+        <w:t xml:space="preserve">, abra um curso e clique na aba </w:t>
+      </w:r>
+      <w:r>
+        <w:rPr>
+          <w:b/>
+        </w:rPr>
+        <w:t xml:space="preserve">Disciplinas</w:t>
       </w:r>
       <w:r>
         <w:t xml:space="preserve">.</w:t>
@@ -2974,10 +3028,19 @@
         <w:rPr>
           <w:b/>
         </w:rPr>
+        <w:t xml:space="preserve">Cursos</w:t>
+      </w:r>
+      <w:r>
+        <w:t xml:space="preserve"> → um curso → aba </w:t>
+      </w:r>
+      <w:r>
+        <w:rPr>
+          <w:b/>
+        </w:rPr>
         <w:t xml:space="preserve">Disciplinas</w:t>
       </w:r>
       <w:r>
-        <w:t xml:space="preserve">, escolha um curso e abra uma linha.</w:t>
+        <w:t xml:space="preserve">, e abra uma linha.</w:t>
       </w:r>
     </w:p>
     <w:p>

</xml_diff>

<commit_message>
docs(BLOCO-7): plano de correções, guia de testes e decisões da implementação
O plano ganha a Rodada 2 e o Bloco 7; o guia de testes (e o .docx gerado dele) passa a descrever os botões de ícone, o sininho, a aba Turmas e a página própria da disciplina; a spec registra as decisões D-14 a D-21. Os painéis de edição da disciplina viram folha de cliente: a página própria, que é servidor, os importa direto e o next build acusou o useRouter.

Co-Authored-By: Claude Opus 5.5 <noreply@anthropic.com>
Claude-Session: https://claude.ai/code/session_01MD3GBaCjFj5U9HKH98W1Z1
</commit_message>
<xml_diff>
--- a/docs/testes/guia-de-testes.docx
+++ b/docs/testes/guia-de-testes.docx
@@ -425,48 +425,264 @@
         <w:pStyle w:val="Heading2"/>
       </w:pPr>
       <w:r>
+        <w:t xml:space="preserve">Os botões são desenhos — o nome aparece ao passar o mouse</w:t>
+      </w:r>
+    </w:p>
+    <w:p>
+      <w:r>
+        <w:t xml:space="preserve">Os botões de ação do sistema (</w:t>
+      </w:r>
+      <w:r>
+        <w:rPr>
+          <w:b/>
+        </w:rPr>
+        <w:t xml:space="preserve">Editar</w:t>
+      </w:r>
+      <w:r>
+        <w:t xml:space="preserve">, </w:t>
+      </w:r>
+      <w:r>
+        <w:rPr>
+          <w:b/>
+        </w:rPr>
+        <w:t xml:space="preserve">Excluir</w:t>
+      </w:r>
+      <w:r>
+        <w:t xml:space="preserve">, </w:t>
+      </w:r>
+      <w:r>
+        <w:rPr>
+          <w:b/>
+        </w:rPr>
+        <w:t xml:space="preserve">Desativar</w:t>
+      </w:r>
+      <w:r>
+        <w:t xml:space="preserve">, </w:t>
+      </w:r>
+      <w:r>
+        <w:rPr>
+          <w:b/>
+        </w:rPr>
+        <w:t xml:space="preserve">Imprimir</w:t>
+      </w:r>
+      <w:r>
+        <w:t xml:space="preserve">, </w:t>
+      </w:r>
+      <w:r>
+        <w:rPr>
+          <w:b/>
+        </w:rPr>
+        <w:t xml:space="preserve">Salvar</w:t>
+      </w:r>
+      <w:r>
+        <w:t xml:space="preserve">, </w:t>
+      </w:r>
+      <w:r>
+        <w:rPr>
+          <w:b/>
+        </w:rPr>
+        <w:t xml:space="preserve">Novo</w:t>
+      </w:r>
+      <w:r>
+        <w:t xml:space="preserve">, </w:t>
+      </w:r>
+      <w:r>
+        <w:rPr>
+          <w:b/>
+        </w:rPr>
+        <w:t xml:space="preserve">Cadastrar</w:t>
+      </w:r>
+      <w:r>
+        <w:t xml:space="preserve">…) são </w:t>
+      </w:r>
+      <w:r>
+        <w:rPr>
+          <w:b/>
+        </w:rPr>
+        <w:t xml:space="preserve">ícones</w:t>
+      </w:r>
+      <w:r>
+        <w:t xml:space="preserve">, sempre </w:t>
+      </w:r>
+      <w:r>
+        <w:rPr>
+          <w:b/>
+        </w:rPr>
+        <w:t xml:space="preserve">no alto e à direita</w:t>
+      </w:r>
+      <w:r>
+        <w:t xml:space="preserve"> da página ou da tabela. Passe o mouse por cima (ou chegue nele com a tecla </w:t>
+      </w:r>
+      <w:r>
+        <w:rPr>
+          <w:b/>
+        </w:rPr>
+        <w:t xml:space="preserve">Tab</w:t>
+      </w:r>
+      <w:r>
+        <w:t xml:space="preserve">) e o nome aparece. Dentro de uma janela de confirmação, como a de excluir, os botões continuam escritos.</w:t>
+      </w:r>
+    </w:p>
+    <w:p>
+      <w:r>
+        <w:t xml:space="preserve">Os formulários </w:t>
+      </w:r>
+      <w:r>
+        <w:rPr>
+          <w:b/>
+        </w:rPr>
+        <w:t xml:space="preserve">não ficam abertos nas páginas</w:t>
+      </w:r>
+      <w:r>
+        <w:t xml:space="preserve">: o curto (uma unidade de ensino, uma avaliação, um regime, uma sala) abre numa </w:t>
+      </w:r>
+      <w:r>
+        <w:rPr>
+          <w:b/>
+        </w:rPr>
+        <w:t xml:space="preserve">janela</w:t>
+      </w:r>
+      <w:r>
+        <w:t xml:space="preserve"> por cima da tela; o longo (o curso, a disciplina) tem uma </w:t>
+      </w:r>
+      <w:r>
+        <w:rPr>
+          <w:b/>
+        </w:rPr>
+        <w:t xml:space="preserve">página própria</w:t>
+      </w:r>
+      <w:r>
+        <w:t xml:space="preserve">.</w:t>
+      </w:r>
+    </w:p>
+    <w:p>
+      <w:pPr>
+        <w:pStyle w:val="Heading2"/>
+      </w:pPr>
+      <w:r>
         <w:t xml:space="preserve">Tema claro e tema escuro</w:t>
       </w:r>
     </w:p>
     <w:p>
       <w:r>
-        <w:t xml:space="preserve">No alto da tela, à direita, há a palavra </w:t>
-      </w:r>
-      <w:r>
-        <w:rPr>
-          <w:b/>
-        </w:rPr>
-        <w:t xml:space="preserve">Tema:</w:t>
-      </w:r>
-      <w:r>
-        <w:t xml:space="preserve"> e três botões: </w:t>
-      </w:r>
-      <w:r>
-        <w:rPr>
-          <w:b/>
-        </w:rPr>
-        <w:t xml:space="preserve">Claro</w:t>
-      </w:r>
-      <w:r>
-        <w:t xml:space="preserve">, </w:t>
-      </w:r>
-      <w:r>
-        <w:rPr>
-          <w:b/>
-        </w:rPr>
-        <w:t xml:space="preserve">Noturno</w:t>
-      </w:r>
-      <w:r>
-        <w:t xml:space="preserve"> e </w:t>
-      </w:r>
-      <w:r>
-        <w:rPr>
-          <w:b/>
-        </w:rPr>
-        <w:t xml:space="preserve">Sistema</w:t>
-      </w:r>
-      <w:r>
-        <w:t xml:space="preserve">. "Noturno" é o tema escuro. "Sistema" segue a configuração do seu Windows. O botão do tema em uso fica marcado.</w:t>
+        <w:t xml:space="preserve">No alto da tela, à direita, há três ícones: um </w:t>
+      </w:r>
+      <w:r>
+        <w:rPr>
+          <w:b/>
+        </w:rPr>
+        <w:t xml:space="preserve">sol</w:t>
+      </w:r>
+      <w:r>
+        <w:t xml:space="preserve"> (tema claro), uma </w:t>
+      </w:r>
+      <w:r>
+        <w:rPr>
+          <w:b/>
+        </w:rPr>
+        <w:t xml:space="preserve">lua</w:t>
+      </w:r>
+      <w:r>
+        <w:t xml:space="preserve"> (tema noturno) e uma </w:t>
+      </w:r>
+      <w:r>
+        <w:rPr>
+          <w:b/>
+        </w:rPr>
+        <w:t xml:space="preserve">tela de computador</w:t>
+      </w:r>
+      <w:r>
+        <w:t xml:space="preserve"> (segue a configuração do seu Windows). "Noturno" é o tema escuro. O ícone do tema em uso fica marcado.</w:t>
+      </w:r>
+    </w:p>
+    <w:p>
+      <w:pPr>
+        <w:pStyle w:val="Heading2"/>
+      </w:pPr>
+      <w:r>
+        <w:t xml:space="preserve">O sininho de avisos</w:t>
+      </w:r>
+    </w:p>
+    <w:p>
+      <w:r>
+        <w:t xml:space="preserve">No alto da tela, à direita, há um </w:t>
+      </w:r>
+      <w:r>
+        <w:rPr>
+          <w:b/>
+        </w:rPr>
+        <w:t xml:space="preserve">sininho</w:t>
+      </w:r>
+      <w:r>
+        <w:t xml:space="preserve"> com o </w:t>
+      </w:r>
+      <w:r>
+        <w:rPr>
+          <w:b/>
+        </w:rPr>
+        <w:t xml:space="preserve">número de avisos</w:t>
+      </w:r>
+      <w:r>
+        <w:t xml:space="preserve"> — turma em atraso, prova sem vista, teto de atividades passado, cadastro incompleto de curso, de turma ou de instrutor. Enquanto houver aviso que você ainda não viu, o sininho </w:t>
+      </w:r>
+      <w:r>
+        <w:rPr>
+          <w:b/>
+        </w:rPr>
+        <w:t xml:space="preserve">pulsa</w:t>
+      </w:r>
+      <w:r>
+        <w:t xml:space="preserve"> de leve. Clique nele: abre a página </w:t>
+      </w:r>
+      <w:r>
+        <w:rPr>
+          <w:b/>
+        </w:rPr>
+        <w:t xml:space="preserve">Avisos</w:t>
+      </w:r>
+      <w:r>
+        <w:t xml:space="preserve">, com os avisos agrupados por assunto, e cada um tem um link para </w:t>
+      </w:r>
+      <w:r>
+        <w:rPr>
+          <w:b/>
+        </w:rPr>
+        <w:t xml:space="preserve">onde se resolve</w:t>
+      </w:r>
+      <w:r>
+        <w:t xml:space="preserve">. Ao abrir a página, o sininho para de pulsar — e só volta a pulsar quando aparecer um aviso </w:t>
+      </w:r>
+      <w:r>
+        <w:rPr>
+          <w:b/>
+        </w:rPr>
+        <w:t xml:space="preserve">novo</w:t>
+      </w:r>
+      <w:r>
+        <w:t xml:space="preserve">. O "já vi" fica lembrado </w:t>
+      </w:r>
+      <w:r>
+        <w:rPr>
+          <w:b/>
+        </w:rPr>
+        <w:t xml:space="preserve">naquele computador</w:t>
+      </w:r>
+      <w:r>
+        <w:t xml:space="preserve">.</w:t>
+      </w:r>
+    </w:p>
+    <w:p>
+      <w:r>
+        <w:t xml:space="preserve">Os avisos </w:t>
+      </w:r>
+      <w:r>
+        <w:rPr>
+          <w:b/>
+        </w:rPr>
+        <w:t xml:space="preserve">não ficam mais em quadros dentro das páginas</w:t>
+      </w:r>
+      <w:r>
+        <w:t xml:space="preserve"> do curso, das turmas e dos instrutores: estão todos no sininho.</w:t>
       </w:r>
     </w:p>
     <w:p>
@@ -977,49 +1193,237 @@
         <w:t xml:space="preserve">Início</w:t>
       </w:r>
       <w:r>
-        <w:t xml:space="preserve">. Você vê quatro quadros no alto — *Turmas no recorte*, *Em andamento*, *Carga executada* e *Progresso do recorte* — e a lista de turmas abaixo.</w:t>
-      </w:r>
-    </w:p>
-    <w:p>
-      <w:pPr>
-        <w:ind w:left="397" w:hanging="397"/>
-        <w:spacing w:after="80"/>
-      </w:pPr>
-      <w:r>
-        <w:t xml:space="preserve">2.	Confira a faixa de avisos, que fica sempre visível: ela diz </w:t>
-      </w:r>
-      <w:r>
-        <w:rPr>
-          <w:b/>
-        </w:rPr>
-        <w:t xml:space="preserve">"Turmas exigindo atenção"</w:t>
-      </w:r>
-      <w:r>
-        <w:t xml:space="preserve"> com a quantidade, ou </w:t>
-      </w:r>
-      <w:r>
-        <w:rPr>
-          <w:b/>
-        </w:rPr>
-        <w:t xml:space="preserve">"Nada exigindo atenção"</w:t>
+        <w:t xml:space="preserve">. No canto superior direito está o </w:t>
+      </w:r>
+      <w:r>
+        <w:rPr>
+          <w:b/>
+        </w:rPr>
+        <w:t xml:space="preserve">ano</w:t>
+      </w:r>
+      <w:r>
+        <w:t xml:space="preserve">; abaixo, quatro números — *Turmas no recorte*, *Em andamento*, *Carga executada* e *Progresso do recorte* — e os cartões das turmas em andamento, que passam sozinhos.</w:t>
+      </w:r>
+    </w:p>
+    <w:p>
+      <w:pPr>
+        <w:ind w:left="397" w:hanging="397"/>
+        <w:spacing w:after="80"/>
+      </w:pPr>
+      <w:r>
+        <w:t xml:space="preserve">2.	Clique no </w:t>
+      </w:r>
+      <w:r>
+        <w:rPr>
+          <w:b/>
+        </w:rPr>
+        <w:t xml:space="preserve">sininho</w:t>
+      </w:r>
+      <w:r>
+        <w:t xml:space="preserve">, no alto da tela, e leia os avisos. Volte ao Início: o sininho parou de pulsar.</w:t>
+      </w:r>
+    </w:p>
+    <w:p>
+      <w:pPr>
+        <w:ind w:left="397" w:hanging="397"/>
+        <w:spacing w:after="80"/>
+      </w:pPr>
+      <w:r>
+        <w:t xml:space="preserve">3.	Troque os filtros </w:t>
+      </w:r>
+      <w:r>
+        <w:rPr>
+          <w:b/>
+        </w:rPr>
+        <w:t xml:space="preserve">Classificação</w:t>
+      </w:r>
+      <w:r>
+        <w:t xml:space="preserve"> e </w:t>
+      </w:r>
+      <w:r>
+        <w:rPr>
+          <w:b/>
+        </w:rPr>
+        <w:t xml:space="preserve">Modalidade</w:t>
+      </w:r>
+      <w:r>
+        <w:t xml:space="preserve"> (os dois começam em "Todas"). Os cartões e os quatro números têm de mudar junto.</w:t>
+      </w:r>
+    </w:p>
+    <w:p>
+      <w:pPr>
+        <w:ind w:left="397" w:hanging="397"/>
+        <w:spacing w:after="80"/>
+      </w:pPr>
+      <w:r>
+        <w:t xml:space="preserve">4.	Clique num cartão de turma: abre a </w:t>
+      </w:r>
+      <w:r>
+        <w:rPr>
+          <w:b/>
+        </w:rPr>
+        <w:t xml:space="preserve">ficha da turma</w:t>
       </w:r>
       <w:r>
         <w:t xml:space="preserve">.</w:t>
       </w:r>
     </w:p>
     <w:p>
-      <w:pPr>
-        <w:ind w:left="397" w:hanging="397"/>
-        <w:spacing w:after="80"/>
-      </w:pPr>
-      <w:r>
-        <w:t xml:space="preserve">3.	Troque os filtros </w:t>
-      </w:r>
-      <w:r>
-        <w:rPr>
-          <w:b/>
-        </w:rPr>
-        <w:t xml:space="preserve">Classificação</w:t>
+      <w:r>
+        <w:rPr>
+          <w:b/>
+        </w:rPr>
+        <w:t xml:space="preserve">Cursos</w:t>
+      </w:r>
+    </w:p>
+    <w:p>
+      <w:pPr>
+        <w:ind w:left="397" w:hanging="397"/>
+        <w:spacing w:after="80"/>
+      </w:pPr>
+      <w:r>
+        <w:t xml:space="preserve">5.	Clique em </w:t>
+      </w:r>
+      <w:r>
+        <w:rPr>
+          <w:b/>
+        </w:rPr>
+        <w:t xml:space="preserve">Cursos</w:t>
+      </w:r>
+      <w:r>
+        <w:t xml:space="preserve">. Os cursos aparecem agrupados por classificação, com dois quadros de números e dois gráficos.</w:t>
+      </w:r>
+    </w:p>
+    <w:p>
+      <w:pPr>
+        <w:ind w:left="397" w:hanging="397"/>
+        <w:spacing w:after="80"/>
+      </w:pPr>
+      <w:r>
+        <w:t xml:space="preserve">6.	O filtro </w:t>
+      </w:r>
+      <w:r>
+        <w:rPr>
+          <w:b/>
+        </w:rPr>
+        <w:t xml:space="preserve">Situação</w:t>
+      </w:r>
+      <w:r>
+        <w:t xml:space="preserve"> começa em </w:t>
+      </w:r>
+      <w:r>
+        <w:rPr>
+          <w:b/>
+        </w:rPr>
+        <w:t xml:space="preserve">"Em oferta"</w:t>
+      </w:r>
+      <w:r>
+        <w:t xml:space="preserve">. Troque para </w:t>
+      </w:r>
+      <w:r>
+        <w:rPr>
+          <w:b/>
+        </w:rPr>
+        <w:t xml:space="preserve">"Fora de oferta"</w:t>
+      </w:r>
+      <w:r>
+        <w:t xml:space="preserve"> e confirme que a lista muda — curso desativado só aparece assim.</w:t>
+      </w:r>
+    </w:p>
+    <w:p>
+      <w:pPr>
+        <w:ind w:left="397" w:hanging="397"/>
+        <w:spacing w:after="80"/>
+      </w:pPr>
+      <w:r>
+        <w:t xml:space="preserve">7.	Abra um curso. Confira o alto da tela: a sigla, o nome, a modalidade e a linha </w:t>
+      </w:r>
+      <w:r>
+        <w:rPr>
+          <w:b/>
+        </w:rPr>
+        <w:t xml:space="preserve">"Regime vigente:"</w:t>
+      </w:r>
+      <w:r>
+        <w:t xml:space="preserve"> escrita em palavras.</w:t>
+      </w:r>
+    </w:p>
+    <w:p>
+      <w:pPr>
+        <w:ind w:left="397" w:hanging="397"/>
+        <w:spacing w:after="80"/>
+      </w:pPr>
+      <w:r>
+        <w:t xml:space="preserve">8.	Os cursos seguem a ordem das classificações: </w:t>
+      </w:r>
+      <w:r>
+        <w:rPr>
+          <w:b/>
+        </w:rPr>
+        <w:t xml:space="preserve">Regulares, Expeditos, Especiais, Estágios de Qualificação, Aperfeiçoamento Avançado</w:t>
+      </w:r>
+      <w:r>
+        <w:t xml:space="preserve"> e as demais; dentro de cada uma, pela sigla.</w:t>
+      </w:r>
+    </w:p>
+    <w:p>
+      <w:pPr>
+        <w:ind w:left="397" w:hanging="397"/>
+        <w:spacing w:after="80"/>
+      </w:pPr>
+      <w:r>
+        <w:t xml:space="preserve">9.	Troque entre as abas da página do curso: </w:t>
+      </w:r>
+      <w:r>
+        <w:rPr>
+          <w:b/>
+        </w:rPr>
+        <w:t xml:space="preserve">Sobre o Curso</w:t>
+      </w:r>
+      <w:r>
+        <w:t xml:space="preserve">, </w:t>
+      </w:r>
+      <w:r>
+        <w:rPr>
+          <w:b/>
+        </w:rPr>
+        <w:t xml:space="preserve">Turmas</w:t>
+      </w:r>
+      <w:r>
+        <w:t xml:space="preserve">, </w:t>
+      </w:r>
+      <w:r>
+        <w:rPr>
+          <w:b/>
+        </w:rPr>
+        <w:t xml:space="preserve">Disciplinas</w:t>
+      </w:r>
+      <w:r>
+        <w:t xml:space="preserve">, </w:t>
+      </w:r>
+      <w:r>
+        <w:rPr>
+          <w:b/>
+        </w:rPr>
+        <w:t xml:space="preserve">Avaliações</w:t>
+      </w:r>
+      <w:r>
+        <w:t xml:space="preserve">, </w:t>
+      </w:r>
+      <w:r>
+        <w:rPr>
+          <w:b/>
+        </w:rPr>
+        <w:t xml:space="preserve">Atividades</w:t>
+      </w:r>
+      <w:r>
+        <w:t xml:space="preserve">, </w:t>
+      </w:r>
+      <w:r>
+        <w:rPr>
+          <w:b/>
+        </w:rPr>
+        <w:t xml:space="preserve">Horários</w:t>
       </w:r>
       <w:r>
         <w:t xml:space="preserve"> e </w:t>
@@ -1028,72 +1432,466 @@
         <w:rPr>
           <w:b/>
         </w:rPr>
-        <w:t xml:space="preserve">Modalidade</w:t>
-      </w:r>
-      <w:r>
-        <w:t xml:space="preserve"> (os dois começam em "Todas"). A lista e os quatro quadros têm de mudar junto.</w:t>
-      </w:r>
-    </w:p>
-    <w:p>
-      <w:pPr>
-        <w:ind w:left="397" w:hanging="397"/>
-        <w:spacing w:after="80"/>
-      </w:pPr>
-      <w:r>
-        <w:t xml:space="preserve">4.	Clique numa turma da lista. </w:t>
-      </w:r>
-      <w:r>
-        <w:rPr>
-          <w:b/>
-        </w:rPr>
-        <w:t xml:space="preserve">Atenção:</w:t>
-      </w:r>
-      <w:r>
-        <w:t xml:space="preserve"> isso abre a </w:t>
-      </w:r>
-      <w:r>
-        <w:rPr>
-          <w:b/>
-        </w:rPr>
-        <w:t xml:space="preserve">página do curso</w:t>
-      </w:r>
-      <w:r>
-        <w:t xml:space="preserve"> com aquela turma escolhida — e não a ficha da turma. É assim mesmo.</w:t>
-      </w:r>
-    </w:p>
-    <w:p>
+        <w:t xml:space="preserve">Currículo</w:t>
+      </w:r>
+      <w:r>
+        <w:t xml:space="preserve">. A aba </w:t>
+      </w:r>
+      <w:r>
+        <w:rPr>
+          <w:b/>
+        </w:rPr>
+        <w:t xml:space="preserve">Turmas</w:t>
+      </w:r>
+      <w:r>
+        <w:t xml:space="preserve"> reúne as turmas do curso; </w:t>
+      </w:r>
+      <w:r>
+        <w:rPr>
+          <w:b/>
+        </w:rPr>
+        <w:t xml:space="preserve">Sobre o Curso</w:t>
+      </w:r>
+      <w:r>
+        <w:t xml:space="preserve"> traz só as informações gerais.</w:t>
+      </w:r>
+    </w:p>
+    <w:p>
+      <w:pPr>
+        <w:ind w:left="397" w:hanging="397"/>
+        <w:spacing w:after="80"/>
+      </w:pPr>
+      <w:r>
+        <w:t xml:space="preserve">10.	Clique em </w:t>
+      </w:r>
+      <w:r>
+        <w:rPr>
+          <w:b/>
+        </w:rPr>
+        <w:t xml:space="preserve">Editar curso</w:t>
+      </w:r>
+      <w:r>
+        <w:t xml:space="preserve">, mude o </w:t>
+      </w:r>
+      <w:r>
+        <w:rPr>
+          <w:b/>
+        </w:rPr>
+        <w:t xml:space="preserve">propósito</w:t>
+      </w:r>
+      <w:r>
+        <w:t xml:space="preserve"> e salve. Deve aparecer confirmação. Se você mudar a sigla, a classificação ou o limite de turmas, o sistema </w:t>
+      </w:r>
+      <w:r>
+        <w:rPr>
+          <w:b/>
+        </w:rPr>
+        <w:t xml:space="preserve">pede confirmação antes</w:t>
+      </w:r>
+      <w:r>
+        <w:t xml:space="preserve"> — leia a pergunta com atenção.</w:t>
+      </w:r>
+    </w:p>
+    <w:p>
+      <w:r>
+        <w:rPr>
+          <w:b/>
+        </w:rPr>
+        <w:t xml:space="preserve">Turmas</w:t>
+      </w:r>
+    </w:p>
+    <w:p>
+      <w:pPr>
+        <w:ind w:left="397" w:hanging="397"/>
+        <w:spacing w:after="80"/>
+      </w:pPr>
+      <w:r>
+        <w:t xml:space="preserve">11.	Clique em </w:t>
+      </w:r>
+      <w:r>
+        <w:rPr>
+          <w:b/>
+        </w:rPr>
+        <w:t xml:space="preserve">Turmas</w:t>
+      </w:r>
+      <w:r>
+        <w:t xml:space="preserve">. Confira a contagem embaixo do título e as colunas: Turma, Curso, Ano, Janela, Situação e Efetivo.</w:t>
+      </w:r>
+    </w:p>
+    <w:p>
+      <w:pPr>
+        <w:ind w:left="397" w:hanging="397"/>
+        <w:spacing w:after="80"/>
+      </w:pPr>
+      <w:r>
+        <w:t xml:space="preserve">12.	Use os filtros </w:t>
+      </w:r>
+      <w:r>
+        <w:rPr>
+          <w:b/>
+        </w:rPr>
+        <w:t xml:space="preserve">Buscar pelo código</w:t>
+      </w:r>
+      <w:r>
+        <w:t xml:space="preserve">, </w:t>
+      </w:r>
+      <w:r>
+        <w:rPr>
+          <w:b/>
+        </w:rPr>
+        <w:t xml:space="preserve">Curso</w:t>
+      </w:r>
+      <w:r>
+        <w:t xml:space="preserve">, </w:t>
+      </w:r>
+      <w:r>
+        <w:rPr>
+          <w:b/>
+        </w:rPr>
+        <w:t xml:space="preserve">Ano letivo</w:t>
+      </w:r>
+      <w:r>
+        <w:t xml:space="preserve"> e </w:t>
+      </w:r>
+      <w:r>
+        <w:rPr>
+          <w:b/>
+        </w:rPr>
+        <w:t xml:space="preserve">Situação</w:t>
+      </w:r>
+      <w:r>
+        <w:t xml:space="preserve">. Depois clique em </w:t>
+      </w:r>
+      <w:r>
+        <w:rPr>
+          <w:b/>
+        </w:rPr>
+        <w:t xml:space="preserve">Limpar filtros</w:t>
+      </w:r>
+      <w:r>
+        <w:t xml:space="preserve"> (ele só aparece quando há filtro).</w:t>
+      </w:r>
+    </w:p>
+    <w:p>
+      <w:pPr>
+        <w:ind w:left="397" w:hanging="397"/>
+        <w:spacing w:after="80"/>
+      </w:pPr>
+      <w:r>
+        <w:t xml:space="preserve">13.	Clique numa turma para abrir a </w:t>
+      </w:r>
+      <w:r>
+        <w:rPr>
+          <w:b/>
+        </w:rPr>
+        <w:t xml:space="preserve">ficha</w:t>
+      </w:r>
+      <w:r>
+        <w:t xml:space="preserve">.</w:t>
+      </w:r>
+    </w:p>
+    <w:p>
+      <w:pPr>
+        <w:ind w:left="397" w:hanging="397"/>
+        <w:spacing w:after="80"/>
+      </w:pPr>
+      <w:r>
+        <w:t xml:space="preserve">14.	Na ficha, confira o alto: Situação, Modalidade, </w:t>
+      </w:r>
+      <w:r>
+        <w:rPr>
+          <w:b/>
+        </w:rPr>
+        <w:t xml:space="preserve">Período</w:t>
+      </w:r>
+      <w:r>
+        <w:t xml:space="preserve">, Sala e Efetivo numa linha só.</w:t>
+      </w:r>
+    </w:p>
+    <w:p>
+      <w:pPr>
+        <w:ind w:left="397" w:hanging="397"/>
+        <w:spacing w:after="80"/>
+      </w:pPr>
+      <w:r>
+        <w:t xml:space="preserve">15.	Confira a seção </w:t>
+      </w:r>
+      <w:r>
+        <w:rPr>
+          <w:b/>
+        </w:rPr>
+        <w:t xml:space="preserve">Andamento</w:t>
+      </w:r>
+      <w:r>
+        <w:t xml:space="preserve">: os quatro indicadores (*CH prevista*, *CH executada*, *Progresso* e </w:t>
+      </w:r>
+      <w:r>
+        <w:rPr>
+          <w:b/>
+        </w:rPr>
+        <w:t xml:space="preserve">Saldo de capacidade (TA)</w:t>
+      </w:r>
+      <w:r>
+        <w:t xml:space="preserve">), a barra de progresso, o </w:t>
+      </w:r>
+      <w:r>
+        <w:rPr>
+          <w:b/>
+        </w:rPr>
+        <w:t xml:space="preserve">Saldo em dias</w:t>
+      </w:r>
+      <w:r>
+        <w:t xml:space="preserve"> e a </w:t>
+      </w:r>
+      <w:r>
+        <w:rPr>
+          <w:b/>
+        </w:rPr>
+        <w:t xml:space="preserve">Capacidade diária</w:t>
+      </w:r>
+      <w:r>
+        <w:t xml:space="preserve">.</w:t>
+      </w:r>
+    </w:p>
+    <w:p>
+      <w:pPr>
+        <w:ind w:left="397" w:hanging="397"/>
+        <w:spacing w:after="80"/>
+      </w:pPr>
+      <w:r>
+        <w:t xml:space="preserve">16.	Procure uma turma com a tarja </w:t>
+      </w:r>
+      <w:r>
+        <w:rPr>
+          <w:b/>
+        </w:rPr>
+        <w:t xml:space="preserve">"Em atraso"</w:t>
+      </w:r>
+      <w:r>
+        <w:t xml:space="preserve">. Ela só aparece em turma </w:t>
+      </w:r>
+      <w:r>
+        <w:rPr>
+          <w:b/>
+        </w:rPr>
+        <w:t xml:space="preserve">ativa</w:t>
+      </w:r>
+      <w:r>
+        <w:t xml:space="preserve"> que tenha data de término e regime de horário — e significa que o tempo que resta até o término não cobre a carga que falta.</w:t>
+      </w:r>
+    </w:p>
+    <w:p>
+      <w:pPr>
+        <w:ind w:left="397" w:hanging="397"/>
+        <w:spacing w:after="80"/>
+      </w:pPr>
+      <w:r>
+        <w:t xml:space="preserve">17.	Desça até </w:t>
+      </w:r>
+      <w:r>
+        <w:rPr>
+          <w:b/>
+        </w:rPr>
+        <w:t xml:space="preserve">Disciplinas</w:t>
+      </w:r>
+      <w:r>
+        <w:t xml:space="preserve"> e confira a tabela, com CH prevista, CH executada e o percentual de cada disciplina.</w:t>
+      </w:r>
+    </w:p>
+    <w:p>
+      <w:pPr>
+        <w:ind w:left="397" w:hanging="397"/>
+        <w:spacing w:after="80"/>
+      </w:pPr>
+      <w:r>
+        <w:t xml:space="preserve">18.	No fim da ficha, clique em </w:t>
+      </w:r>
+      <w:r>
+        <w:rPr>
+          <w:b/>
+        </w:rPr>
+        <w:t xml:space="preserve">Editar turma</w:t>
+      </w:r>
+      <w:r>
+        <w:t xml:space="preserve">: o formulário abre. Mude o </w:t>
+      </w:r>
+      <w:r>
+        <w:rPr>
+          <w:b/>
+        </w:rPr>
+        <w:t xml:space="preserve">efetivo</w:t>
+      </w:r>
+      <w:r>
+        <w:t xml:space="preserve"> e salve. </w:t>
+      </w:r>
+      <w:r>
+        <w:rPr>
+          <w:b/>
+        </w:rPr>
+        <w:t xml:space="preserve">Cuidado:</w:t>
+      </w:r>
+      <w:r>
+        <w:t xml:space="preserve"> fechar o painel apaga o que você digitou e não salvou. O período e os instrutores de cada disciplina se editam pelo </w:t>
+      </w:r>
+      <w:r>
+        <w:rPr>
+          <w:b/>
+        </w:rPr>
+        <w:t xml:space="preserve">ícone de lápis</w:t>
+      </w:r>
+      <w:r>
+        <w:t xml:space="preserve"> da linha, numa janela.</w:t>
+      </w:r>
+    </w:p>
+    <w:p>
+      <w:r>
+        <w:rPr>
+          <w:b/>
+        </w:rPr>
+        <w:t xml:space="preserve">Disciplinas</w:t>
+      </w:r>
+    </w:p>
+    <w:p>
+      <w:pPr>
+        <w:ind w:left="397" w:hanging="397"/>
+        <w:spacing w:after="80"/>
+      </w:pPr>
+      <w:r>
+        <w:t xml:space="preserve">19.	As disciplinas ficam </w:t>
+      </w:r>
+      <w:r>
+        <w:rPr>
+          <w:b/>
+        </w:rPr>
+        <w:t xml:space="preserve">dentro do curso</w:t>
+      </w:r>
+      <w:r>
+        <w:t xml:space="preserve"> (não há mais </w:t>
+      </w:r>
+      <w:r>
+        <w:rPr>
+          <w:b/>
+        </w:rPr>
+        <w:t xml:space="preserve">Disciplinas</w:t>
+      </w:r>
+      <w:r>
+        <w:t xml:space="preserve"> no menu): clique em </w:t>
+      </w:r>
       <w:r>
         <w:rPr>
           <w:b/>
         </w:rPr>
         <w:t xml:space="preserve">Cursos</w:t>
       </w:r>
-    </w:p>
-    <w:p>
-      <w:pPr>
-        <w:ind w:left="397" w:hanging="397"/>
-        <w:spacing w:after="80"/>
-      </w:pPr>
-      <w:r>
-        <w:t xml:space="preserve">5.	Clique em </w:t>
-      </w:r>
-      <w:r>
-        <w:rPr>
-          <w:b/>
-        </w:rPr>
-        <w:t xml:space="preserve">Cursos</w:t>
-      </w:r>
-      <w:r>
-        <w:t xml:space="preserve">. Os cursos aparecem agrupados por classificação, com dois quadros de números e dois gráficos.</w:t>
-      </w:r>
-    </w:p>
-    <w:p>
-      <w:pPr>
-        <w:ind w:left="397" w:hanging="397"/>
-        <w:spacing w:after="80"/>
-      </w:pPr>
-      <w:r>
-        <w:t xml:space="preserve">6.	O filtro </w:t>
+      <w:r>
+        <w:t xml:space="preserve">, abra um curso e clique na aba </w:t>
+      </w:r>
+      <w:r>
+        <w:rPr>
+          <w:b/>
+        </w:rPr>
+        <w:t xml:space="preserve">Disciplinas</w:t>
+      </w:r>
+      <w:r>
+        <w:t xml:space="preserve">. Ali elas são só para ler.</w:t>
+      </w:r>
+    </w:p>
+    <w:p>
+      <w:pPr>
+        <w:ind w:left="397" w:hanging="397"/>
+        <w:spacing w:after="80"/>
+      </w:pPr>
+      <w:r>
+        <w:t xml:space="preserve">20.	Clique numa linha para abrir o detalhe. Para fechar, clique em </w:t>
+      </w:r>
+      <w:r>
+        <w:rPr>
+          <w:b/>
+        </w:rPr>
+        <w:t xml:space="preserve">outra</w:t>
+      </w:r>
+      <w:r>
+        <w:t xml:space="preserve"> linha — nesta tela, clicar de novo na mesma não fecha.</w:t>
+      </w:r>
+    </w:p>
+    <w:p>
+      <w:pPr>
+        <w:ind w:left="397" w:hanging="397"/>
+        <w:spacing w:after="80"/>
+      </w:pPr>
+      <w:r>
+        <w:t xml:space="preserve">21.	Para corrigir, clique em </w:t>
+      </w:r>
+      <w:r>
+        <w:rPr>
+          <w:b/>
+        </w:rPr>
+        <w:t xml:space="preserve">Editar curso</w:t>
+      </w:r>
+      <w:r>
+        <w:t xml:space="preserve"> → </w:t>
+      </w:r>
+      <w:r>
+        <w:rPr>
+          <w:b/>
+        </w:rPr>
+        <w:t xml:space="preserve">Disciplinas e avaliações</w:t>
+      </w:r>
+      <w:r>
+        <w:t xml:space="preserve">, abra a linha e clique no </w:t>
+      </w:r>
+      <w:r>
+        <w:rPr>
+          <w:b/>
+        </w:rPr>
+        <w:t xml:space="preserve">lápis</w:t>
+      </w:r>
+      <w:r>
+        <w:t xml:space="preserve"> (*Editar disciplina*): abre a página da disciplina. Corrija o nome ou a carga e salve. As unidades de ensino e as avaliações do currículo se editam ali, pelo lápis de cada linha, numa janela.</w:t>
+      </w:r>
+    </w:p>
+    <w:p>
+      <w:r>
+        <w:rPr>
+          <w:b/>
+        </w:rPr>
+        <w:t xml:space="preserve">Instrutores</w:t>
+      </w:r>
+    </w:p>
+    <w:p>
+      <w:pPr>
+        <w:ind w:left="397" w:hanging="397"/>
+        <w:spacing w:after="80"/>
+      </w:pPr>
+      <w:r>
+        <w:t xml:space="preserve">22.	Clique em </w:t>
+      </w:r>
+      <w:r>
+        <w:rPr>
+          <w:b/>
+        </w:rPr>
+        <w:t xml:space="preserve">Instrutores</w:t>
+      </w:r>
+      <w:r>
+        <w:t xml:space="preserve">. A lista sai </w:t>
+      </w:r>
+      <w:r>
+        <w:rPr>
+          <w:b/>
+        </w:rPr>
+        <w:t xml:space="preserve">sempre por antiguidade</w:t>
+      </w:r>
+      <w:r>
+        <w:t xml:space="preserve">.</w:t>
+      </w:r>
+    </w:p>
+    <w:p>
+      <w:pPr>
+        <w:ind w:left="397" w:hanging="397"/>
+        <w:spacing w:after="80"/>
+      </w:pPr>
+      <w:r>
+        <w:t xml:space="preserve">23.	Use alguns dos filtros. O filtro </w:t>
       </w:r>
       <w:r>
         <w:rPr>
@@ -1108,70 +1906,212 @@
         <w:rPr>
           <w:b/>
         </w:rPr>
-        <w:t xml:space="preserve">"Em oferta"</w:t>
-      </w:r>
-      <w:r>
-        <w:t xml:space="preserve">. Troque para </w:t>
-      </w:r>
-      <w:r>
-        <w:rPr>
-          <w:b/>
-        </w:rPr>
-        <w:t xml:space="preserve">"Fora de oferta"</w:t>
-      </w:r>
-      <w:r>
-        <w:t xml:space="preserve"> e confirme que a lista muda — curso desativado só aparece assim.</w:t>
-      </w:r>
-    </w:p>
-    <w:p>
-      <w:pPr>
-        <w:ind w:left="397" w:hanging="397"/>
-        <w:spacing w:after="80"/>
-      </w:pPr>
-      <w:r>
-        <w:t xml:space="preserve">7.	Abra um curso. Confira o alto da tela: a sigla, o nome, a modalidade e a linha </w:t>
-      </w:r>
-      <w:r>
-        <w:rPr>
-          <w:b/>
-        </w:rPr>
-        <w:t xml:space="preserve">"Regime vigente:"</w:t>
-      </w:r>
-      <w:r>
-        <w:t xml:space="preserve"> escrita em palavras.</w:t>
-      </w:r>
-    </w:p>
-    <w:p>
-      <w:pPr>
-        <w:ind w:left="397" w:hanging="397"/>
-        <w:spacing w:after="80"/>
-      </w:pPr>
-      <w:r>
-        <w:t xml:space="preserve">8.	Abra o quadro </w:t>
-      </w:r>
-      <w:r>
-        <w:rPr>
-          <w:b/>
-        </w:rPr>
-        <w:t xml:space="preserve">"Avisos de qualidade de cadastro"</w:t>
-      </w:r>
-      <w:r>
-        <w:t xml:space="preserve"> (ele começa fechado, mostrando só a quantidade) e leia os avisos. Nenhum deles impede gravar.</w:t>
-      </w:r>
-    </w:p>
-    <w:p>
-      <w:pPr>
-        <w:ind w:left="397" w:hanging="397"/>
-        <w:spacing w:after="80"/>
-      </w:pPr>
-      <w:r>
-        <w:t xml:space="preserve">9.	Troque entre as abas da página do curso: </w:t>
-      </w:r>
-      <w:r>
-        <w:rPr>
-          <w:b/>
-        </w:rPr>
-        <w:t xml:space="preserve">Sobre o Curso</w:t>
+        <w:t xml:space="preserve">"Ativos"</w:t>
+      </w:r>
+      <w:r>
+        <w:t xml:space="preserve"> — instrutor inativo só aparece trocando para "Inativos".</w:t>
+      </w:r>
+    </w:p>
+    <w:p>
+      <w:pPr>
+        <w:ind w:left="397" w:hanging="397"/>
+        <w:spacing w:after="80"/>
+      </w:pPr>
+      <w:r>
+        <w:t xml:space="preserve">24.	Abra a ficha de um instrutor. Os alertas dele (carga fora da faixa, capacitação vencida) estão no </w:t>
+      </w:r>
+      <w:r>
+        <w:rPr>
+          <w:b/>
+        </w:rPr>
+        <w:t xml:space="preserve">sininho</w:t>
+      </w:r>
+      <w:r>
+        <w:t xml:space="preserve">, com o link para a ficha — e </w:t>
+      </w:r>
+      <w:r>
+        <w:rPr>
+          <w:b/>
+        </w:rPr>
+        <w:t xml:space="preserve">avisam, não impedem nada</w:t>
+      </w:r>
+      <w:r>
+        <w:t xml:space="preserve">.</w:t>
+      </w:r>
+    </w:p>
+    <w:p>
+      <w:pPr>
+        <w:ind w:left="397" w:hanging="397"/>
+        <w:spacing w:after="80"/>
+      </w:pPr>
+      <w:r>
+        <w:t xml:space="preserve">25.	Clique em </w:t>
+      </w:r>
+      <w:r>
+        <w:rPr>
+          <w:b/>
+        </w:rPr>
+        <w:t xml:space="preserve">Editar cadastro</w:t>
+      </w:r>
+      <w:r>
+        <w:t xml:space="preserve"> no fim da ficha, corrija um dado e salve.</w:t>
+      </w:r>
+    </w:p>
+    <w:p>
+      <w:r>
+        <w:rPr>
+          <w:b/>
+        </w:rPr>
+        <w:t xml:space="preserve">Meu perfil</w:t>
+      </w:r>
+    </w:p>
+    <w:p>
+      <w:pPr>
+        <w:ind w:left="397" w:hanging="397"/>
+        <w:spacing w:after="80"/>
+      </w:pPr>
+      <w:r>
+        <w:t xml:space="preserve">26.	Clique na sua foto → </w:t>
+      </w:r>
+      <w:r>
+        <w:rPr>
+          <w:b/>
+        </w:rPr>
+        <w:t xml:space="preserve">Meu perfil</w:t>
+      </w:r>
+      <w:r>
+        <w:t xml:space="preserve">. Clique no </w:t>
+      </w:r>
+      <w:r>
+        <w:rPr>
+          <w:b/>
+        </w:rPr>
+        <w:t xml:space="preserve">lápis</w:t>
+      </w:r>
+      <w:r>
+        <w:t xml:space="preserve"> ao lado do nome, troque o seu </w:t>
+      </w:r>
+      <w:r>
+        <w:rPr>
+          <w:b/>
+        </w:rPr>
+        <w:t xml:space="preserve">nome de exibição</w:t>
+      </w:r>
+      <w:r>
+        <w:t xml:space="preserve"> na janela e clique em </w:t>
+      </w:r>
+      <w:r>
+        <w:rPr>
+          <w:b/>
+        </w:rPr>
+        <w:t xml:space="preserve">Gravar nome</w:t>
+      </w:r>
+      <w:r>
+        <w:t xml:space="preserve">.</w:t>
+      </w:r>
+    </w:p>
+    <w:p>
+      <w:pPr>
+        <w:ind w:left="397" w:hanging="397"/>
+        <w:spacing w:after="80"/>
+      </w:pPr>
+      <w:r>
+        <w:t xml:space="preserve">27.	Clique em </w:t>
+      </w:r>
+      <w:r>
+        <w:rPr>
+          <w:b/>
+        </w:rPr>
+        <w:t xml:space="preserve">Enviar foto</w:t>
+      </w:r>
+      <w:r>
+        <w:t xml:space="preserve"> e escolha um arquivo. </w:t>
+      </w:r>
+      <w:r>
+        <w:rPr>
+          <w:b/>
+        </w:rPr>
+        <w:t xml:space="preserve">Escolher o arquivo já envia</w:t>
+      </w:r>
+      <w:r>
+        <w:t xml:space="preserve"> — não há segundo botão. A foto precisa ser </w:t>
+      </w:r>
+      <w:r>
+        <w:rPr>
+          <w:b/>
+        </w:rPr>
+        <w:t xml:space="preserve">JPG ou PNG, de até 2 MB</w:t>
+      </w:r>
+      <w:r>
+        <w:t xml:space="preserve">.</w:t>
+      </w:r>
+    </w:p>
+    <w:p>
+      <w:pPr>
+        <w:ind w:left="397" w:hanging="397"/>
+        <w:spacing w:after="80"/>
+      </w:pPr>
+      <w:r>
+        <w:t xml:space="preserve">28.	Confira que </w:t>
+      </w:r>
+      <w:r>
+        <w:rPr>
+          <w:b/>
+        </w:rPr>
+        <w:t xml:space="preserve">E-mail</w:t>
+      </w:r>
+      <w:r>
+        <w:t xml:space="preserve"> e </w:t>
+      </w:r>
+      <w:r>
+        <w:rPr>
+          <w:b/>
+        </w:rPr>
+        <w:t xml:space="preserve">Perfil</w:t>
+      </w:r>
+      <w:r>
+        <w:t xml:space="preserve"> aparecem só para leitura, com a razão escrita embaixo.</w:t>
+      </w:r>
+    </w:p>
+    <w:p>
+      <w:r>
+        <w:rPr>
+          <w:b/>
+        </w:rPr>
+        <w:t xml:space="preserve">Administração</w:t>
+      </w:r>
+    </w:p>
+    <w:p>
+      <w:pPr>
+        <w:ind w:left="397" w:hanging="397"/>
+        <w:spacing w:after="80"/>
+      </w:pPr>
+      <w:r>
+        <w:t xml:space="preserve">29.	Clique em </w:t>
+      </w:r>
+      <w:r>
+        <w:rPr>
+          <w:b/>
+        </w:rPr>
+        <w:t xml:space="preserve">Administração</w:t>
+      </w:r>
+      <w:r>
+        <w:t xml:space="preserve">. Você cai em </w:t>
+      </w:r>
+      <w:r>
+        <w:rPr>
+          <w:b/>
+        </w:rPr>
+        <w:t xml:space="preserve">Usuários</w:t>
+      </w:r>
+      <w:r>
+        <w:t xml:space="preserve"> e vê as três abas: </w:t>
+      </w:r>
+      <w:r>
+        <w:rPr>
+          <w:b/>
+        </w:rPr>
+        <w:t xml:space="preserve">Usuários</w:t>
       </w:r>
       <w:r>
         <w:t xml:space="preserve">, </w:t>
@@ -1180,7 +2120,43 @@
         <w:rPr>
           <w:b/>
         </w:rPr>
-        <w:t xml:space="preserve">Grade</w:t>
+        <w:t xml:space="preserve">Permissões</w:t>
+      </w:r>
+      <w:r>
+        <w:t xml:space="preserve"> e </w:t>
+      </w:r>
+      <w:r>
+        <w:rPr>
+          <w:b/>
+        </w:rPr>
+        <w:t xml:space="preserve">Salas</w:t>
+      </w:r>
+      <w:r>
+        <w:t xml:space="preserve">.</w:t>
+      </w:r>
+    </w:p>
+    <w:p>
+      <w:pPr>
+        <w:ind w:left="397" w:hanging="397"/>
+        <w:spacing w:after="80"/>
+      </w:pPr>
+      <w:r>
+        <w:t xml:space="preserve">30.	Em </w:t>
+      </w:r>
+      <w:r>
+        <w:rPr>
+          <w:b/>
+        </w:rPr>
+        <w:t xml:space="preserve">Usuários</w:t>
+      </w:r>
+      <w:r>
+        <w:t xml:space="preserve">, confira a lista e os quatro ícones de cada linha: </w:t>
+      </w:r>
+      <w:r>
+        <w:rPr>
+          <w:b/>
+        </w:rPr>
+        <w:t xml:space="preserve">Editar</w:t>
       </w:r>
       <w:r>
         <w:t xml:space="preserve">, </w:t>
@@ -1189,7 +2165,7 @@
         <w:rPr>
           <w:b/>
         </w:rPr>
-        <w:t xml:space="preserve">Disciplinas</w:t>
+        <w:t xml:space="preserve">Redefinir senha</w:t>
       </w:r>
       <w:r>
         <w:t xml:space="preserve">, </w:t>
@@ -1198,16 +2174,7 @@
         <w:rPr>
           <w:b/>
         </w:rPr>
-        <w:t xml:space="preserve">Avaliações</w:t>
-      </w:r>
-      <w:r>
-        <w:t xml:space="preserve">, </w:t>
-      </w:r>
-      <w:r>
-        <w:rPr>
-          <w:b/>
-        </w:rPr>
-        <w:t xml:space="preserve">Atividades</w:t>
+        <w:t xml:space="preserve">Desativar</w:t>
       </w:r>
       <w:r>
         <w:t xml:space="preserve"> e </w:t>
@@ -1216,626 +2183,19 @@
         <w:rPr>
           <w:b/>
         </w:rPr>
-        <w:t xml:space="preserve">Horários</w:t>
-      </w:r>
-      <w:r>
-        <w:t xml:space="preserve">.</w:t>
-      </w:r>
-    </w:p>
-    <w:p>
-      <w:pPr>
-        <w:ind w:left="397" w:hanging="397"/>
-        <w:spacing w:after="80"/>
-      </w:pPr>
-      <w:r>
-        <w:t xml:space="preserve">10.	Clique em </w:t>
-      </w:r>
-      <w:r>
-        <w:rPr>
-          <w:b/>
-        </w:rPr>
-        <w:t xml:space="preserve">Editar curso</w:t>
-      </w:r>
-      <w:r>
-        <w:t xml:space="preserve">, mude o </w:t>
-      </w:r>
-      <w:r>
-        <w:rPr>
-          <w:b/>
-        </w:rPr>
-        <w:t xml:space="preserve">propósito</w:t>
-      </w:r>
-      <w:r>
-        <w:t xml:space="preserve"> e salve. Deve aparecer confirmação. Se você mudar a sigla, a classificação ou o limite de turmas, o sistema </w:t>
-      </w:r>
-      <w:r>
-        <w:rPr>
-          <w:b/>
-        </w:rPr>
-        <w:t xml:space="preserve">pede confirmação antes</w:t>
-      </w:r>
-      <w:r>
-        <w:t xml:space="preserve"> — leia a pergunta com atenção.</w:t>
-      </w:r>
-    </w:p>
-    <w:p>
-      <w:r>
-        <w:rPr>
-          <w:b/>
-        </w:rPr>
-        <w:t xml:space="preserve">Turmas</w:t>
-      </w:r>
-    </w:p>
-    <w:p>
-      <w:pPr>
-        <w:ind w:left="397" w:hanging="397"/>
-        <w:spacing w:after="80"/>
-      </w:pPr>
-      <w:r>
-        <w:t xml:space="preserve">11.	Clique em </w:t>
-      </w:r>
-      <w:r>
-        <w:rPr>
-          <w:b/>
-        </w:rPr>
-        <w:t xml:space="preserve">Turmas</w:t>
-      </w:r>
-      <w:r>
-        <w:t xml:space="preserve">. Confira a contagem embaixo do título e as colunas: Turma, Curso, Ano, Janela, Situação e Efetivo.</w:t>
-      </w:r>
-    </w:p>
-    <w:p>
-      <w:pPr>
-        <w:ind w:left="397" w:hanging="397"/>
-        <w:spacing w:after="80"/>
-      </w:pPr>
-      <w:r>
-        <w:t xml:space="preserve">12.	Use os filtros </w:t>
-      </w:r>
-      <w:r>
-        <w:rPr>
-          <w:b/>
-        </w:rPr>
-        <w:t xml:space="preserve">Buscar pelo código</w:t>
-      </w:r>
-      <w:r>
-        <w:t xml:space="preserve">, </w:t>
-      </w:r>
-      <w:r>
-        <w:rPr>
-          <w:b/>
-        </w:rPr>
-        <w:t xml:space="preserve">Curso</w:t>
-      </w:r>
-      <w:r>
-        <w:t xml:space="preserve">, </w:t>
-      </w:r>
-      <w:r>
-        <w:rPr>
-          <w:b/>
-        </w:rPr>
-        <w:t xml:space="preserve">Ano letivo</w:t>
-      </w:r>
-      <w:r>
-        <w:t xml:space="preserve"> e </w:t>
-      </w:r>
-      <w:r>
-        <w:rPr>
-          <w:b/>
-        </w:rPr>
-        <w:t xml:space="preserve">Situação</w:t>
-      </w:r>
-      <w:r>
-        <w:t xml:space="preserve">. Depois clique em </w:t>
-      </w:r>
-      <w:r>
-        <w:rPr>
-          <w:b/>
-        </w:rPr>
-        <w:t xml:space="preserve">Limpar filtros</w:t>
-      </w:r>
-      <w:r>
-        <w:t xml:space="preserve"> (ele só aparece quando há filtro).</w:t>
-      </w:r>
-    </w:p>
-    <w:p>
-      <w:pPr>
-        <w:ind w:left="397" w:hanging="397"/>
-        <w:spacing w:after="80"/>
-      </w:pPr>
-      <w:r>
-        <w:t xml:space="preserve">13.	Clique numa turma para abrir a </w:t>
-      </w:r>
-      <w:r>
-        <w:rPr>
-          <w:b/>
-        </w:rPr>
-        <w:t xml:space="preserve">ficha</w:t>
-      </w:r>
-      <w:r>
-        <w:t xml:space="preserve">.</w:t>
-      </w:r>
-    </w:p>
-    <w:p>
-      <w:pPr>
-        <w:ind w:left="397" w:hanging="397"/>
-        <w:spacing w:after="80"/>
-      </w:pPr>
-      <w:r>
-        <w:t xml:space="preserve">14.	Na ficha, confira o alto: Situação, Modalidade, </w:t>
-      </w:r>
-      <w:r>
-        <w:rPr>
-          <w:b/>
-        </w:rPr>
-        <w:t xml:space="preserve">Período</w:t>
-      </w:r>
-      <w:r>
-        <w:t xml:space="preserve">, Sala e Efetivo numa linha só.</w:t>
-      </w:r>
-    </w:p>
-    <w:p>
-      <w:pPr>
-        <w:ind w:left="397" w:hanging="397"/>
-        <w:spacing w:after="80"/>
-      </w:pPr>
-      <w:r>
-        <w:t xml:space="preserve">15.	Confira a seção </w:t>
-      </w:r>
-      <w:r>
-        <w:rPr>
-          <w:b/>
-        </w:rPr>
-        <w:t xml:space="preserve">Andamento</w:t>
-      </w:r>
-      <w:r>
-        <w:t xml:space="preserve">: os quatro indicadores (*CH prevista*, *CH executada*, *Progresso* e </w:t>
-      </w:r>
-      <w:r>
-        <w:rPr>
-          <w:b/>
-        </w:rPr>
-        <w:t xml:space="preserve">Saldo de capacidade (TA)</w:t>
-      </w:r>
-      <w:r>
-        <w:t xml:space="preserve">), a barra de progresso, o </w:t>
-      </w:r>
-      <w:r>
-        <w:rPr>
-          <w:b/>
-        </w:rPr>
-        <w:t xml:space="preserve">Saldo em dias</w:t>
-      </w:r>
-      <w:r>
-        <w:t xml:space="preserve"> e a </w:t>
-      </w:r>
-      <w:r>
-        <w:rPr>
-          <w:b/>
-        </w:rPr>
-        <w:t xml:space="preserve">Capacidade diária</w:t>
-      </w:r>
-      <w:r>
-        <w:t xml:space="preserve">.</w:t>
-      </w:r>
-    </w:p>
-    <w:p>
-      <w:pPr>
-        <w:ind w:left="397" w:hanging="397"/>
-        <w:spacing w:after="80"/>
-      </w:pPr>
-      <w:r>
-        <w:t xml:space="preserve">16.	Procure uma turma com a tarja </w:t>
-      </w:r>
-      <w:r>
-        <w:rPr>
-          <w:b/>
-        </w:rPr>
-        <w:t xml:space="preserve">"Em atraso"</w:t>
-      </w:r>
-      <w:r>
-        <w:t xml:space="preserve">. Ela só aparece em turma </w:t>
-      </w:r>
-      <w:r>
-        <w:rPr>
-          <w:b/>
-        </w:rPr>
-        <w:t xml:space="preserve">ativa</w:t>
-      </w:r>
-      <w:r>
-        <w:t xml:space="preserve"> que tenha data de término e regime de horário — e significa que o tempo que resta até o término não cobre a carga que falta.</w:t>
-      </w:r>
-    </w:p>
-    <w:p>
-      <w:pPr>
-        <w:ind w:left="397" w:hanging="397"/>
-        <w:spacing w:after="80"/>
-      </w:pPr>
-      <w:r>
-        <w:t xml:space="preserve">17.	Desça até </w:t>
-      </w:r>
-      <w:r>
-        <w:rPr>
-          <w:b/>
-        </w:rPr>
-        <w:t xml:space="preserve">Disciplinas</w:t>
-      </w:r>
-      <w:r>
-        <w:t xml:space="preserve"> e confira a tabela, com CH prevista, CH executada e o percentual de cada disciplina.</w:t>
-      </w:r>
-    </w:p>
-    <w:p>
-      <w:pPr>
-        <w:ind w:left="397" w:hanging="397"/>
-        <w:spacing w:after="80"/>
-      </w:pPr>
-      <w:r>
-        <w:t xml:space="preserve">18.	No fim da ficha, clique em </w:t>
-      </w:r>
-      <w:r>
-        <w:rPr>
-          <w:b/>
-        </w:rPr>
-        <w:t xml:space="preserve">Editar turma</w:t>
-      </w:r>
-      <w:r>
-        <w:t xml:space="preserve">: o formulário abre. Mude o </w:t>
-      </w:r>
-      <w:r>
-        <w:rPr>
-          <w:b/>
-        </w:rPr>
-        <w:t xml:space="preserve">efetivo</w:t>
-      </w:r>
-      <w:r>
-        <w:t xml:space="preserve"> e salve. </w:t>
-      </w:r>
-      <w:r>
-        <w:rPr>
-          <w:b/>
-        </w:rPr>
-        <w:t xml:space="preserve">Cuidado:</w:t>
-      </w:r>
-      <w:r>
-        <w:t xml:space="preserve"> fechar o painel apaga o que você digitou e não salvou.</w:t>
-      </w:r>
-    </w:p>
-    <w:p>
-      <w:r>
-        <w:rPr>
-          <w:b/>
-        </w:rPr>
-        <w:t xml:space="preserve">Disciplinas</w:t>
-      </w:r>
-    </w:p>
-    <w:p>
-      <w:pPr>
-        <w:ind w:left="397" w:hanging="397"/>
-        <w:spacing w:after="80"/>
-      </w:pPr>
-      <w:r>
-        <w:t xml:space="preserve">19.	As disciplinas ficam </w:t>
-      </w:r>
-      <w:r>
-        <w:rPr>
-          <w:b/>
-        </w:rPr>
-        <w:t xml:space="preserve">dentro do curso</w:t>
-      </w:r>
-      <w:r>
-        <w:t xml:space="preserve"> (não há mais </w:t>
-      </w:r>
-      <w:r>
-        <w:rPr>
-          <w:b/>
-        </w:rPr>
-        <w:t xml:space="preserve">Disciplinas</w:t>
-      </w:r>
-      <w:r>
-        <w:t xml:space="preserve"> no menu): clique em </w:t>
-      </w:r>
-      <w:r>
-        <w:rPr>
-          <w:b/>
-        </w:rPr>
-        <w:t xml:space="preserve">Cursos</w:t>
-      </w:r>
-      <w:r>
-        <w:t xml:space="preserve">, abra um curso e clique na aba </w:t>
-      </w:r>
-      <w:r>
-        <w:rPr>
-          <w:b/>
-        </w:rPr>
-        <w:t xml:space="preserve">Disciplinas</w:t>
-      </w:r>
-      <w:r>
-        <w:t xml:space="preserve">.</w:t>
-      </w:r>
-    </w:p>
-    <w:p>
-      <w:pPr>
-        <w:ind w:left="397" w:hanging="397"/>
-        <w:spacing w:after="80"/>
-      </w:pPr>
-      <w:r>
-        <w:t xml:space="preserve">20.	Clique numa linha para abrir o detalhe. Para fechar, clique em </w:t>
-      </w:r>
-      <w:r>
-        <w:rPr>
-          <w:b/>
-        </w:rPr>
-        <w:t xml:space="preserve">outra</w:t>
-      </w:r>
-      <w:r>
-        <w:t xml:space="preserve"> linha — nesta tela, clicar de novo na mesma não fecha.</w:t>
-      </w:r>
-    </w:p>
-    <w:p>
-      <w:pPr>
-        <w:ind w:left="397" w:hanging="397"/>
-        <w:spacing w:after="80"/>
-      </w:pPr>
-      <w:r>
-        <w:t xml:space="preserve">21.	Clique em </w:t>
-      </w:r>
-      <w:r>
-        <w:rPr>
-          <w:b/>
-        </w:rPr>
-        <w:t xml:space="preserve">Editar disciplina</w:t>
-      </w:r>
-      <w:r>
-        <w:t xml:space="preserve">, corrija o nome ou a carga e salve.</w:t>
-      </w:r>
-    </w:p>
-    <w:p>
-      <w:r>
-        <w:rPr>
-          <w:b/>
-        </w:rPr>
-        <w:t xml:space="preserve">Instrutores</w:t>
-      </w:r>
-    </w:p>
-    <w:p>
-      <w:pPr>
-        <w:ind w:left="397" w:hanging="397"/>
-        <w:spacing w:after="80"/>
-      </w:pPr>
-      <w:r>
-        <w:t xml:space="preserve">22.	Clique em </w:t>
-      </w:r>
-      <w:r>
-        <w:rPr>
-          <w:b/>
-        </w:rPr>
-        <w:t xml:space="preserve">Instrutores</w:t>
-      </w:r>
-      <w:r>
-        <w:t xml:space="preserve">. A lista sai </w:t>
-      </w:r>
-      <w:r>
-        <w:rPr>
-          <w:b/>
-        </w:rPr>
-        <w:t xml:space="preserve">sempre por antiguidade</w:t>
-      </w:r>
-      <w:r>
-        <w:t xml:space="preserve">.</w:t>
-      </w:r>
-    </w:p>
-    <w:p>
-      <w:pPr>
-        <w:ind w:left="397" w:hanging="397"/>
-        <w:spacing w:after="80"/>
-      </w:pPr>
-      <w:r>
-        <w:t xml:space="preserve">23.	Use alguns dos filtros. O filtro </w:t>
-      </w:r>
-      <w:r>
-        <w:rPr>
-          <w:b/>
-        </w:rPr>
-        <w:t xml:space="preserve">Situação</w:t>
-      </w:r>
-      <w:r>
-        <w:t xml:space="preserve"> começa em </w:t>
-      </w:r>
-      <w:r>
-        <w:rPr>
-          <w:b/>
-        </w:rPr>
-        <w:t xml:space="preserve">"Ativos"</w:t>
-      </w:r>
-      <w:r>
-        <w:t xml:space="preserve"> — instrutor inativo só aparece trocando para "Inativos".</w:t>
-      </w:r>
-    </w:p>
-    <w:p>
-      <w:pPr>
-        <w:ind w:left="397" w:hanging="397"/>
-        <w:spacing w:after="80"/>
-      </w:pPr>
-      <w:r>
-        <w:t xml:space="preserve">24.	Abra a ficha de um instrutor e leia os alertas do alto, que </w:t>
-      </w:r>
-      <w:r>
-        <w:rPr>
-          <w:b/>
-        </w:rPr>
-        <w:t xml:space="preserve">avisam e não impedem nada</w:t>
-      </w:r>
-      <w:r>
-        <w:t xml:space="preserve">.</w:t>
-      </w:r>
-    </w:p>
-    <w:p>
-      <w:pPr>
-        <w:ind w:left="397" w:hanging="397"/>
-        <w:spacing w:after="80"/>
-      </w:pPr>
-      <w:r>
-        <w:t xml:space="preserve">25.	Clique em </w:t>
-      </w:r>
-      <w:r>
-        <w:rPr>
-          <w:b/>
-        </w:rPr>
-        <w:t xml:space="preserve">Editar cadastro</w:t>
-      </w:r>
-      <w:r>
-        <w:t xml:space="preserve"> no fim da ficha, corrija um dado e salve.</w:t>
-      </w:r>
-    </w:p>
-    <w:p>
-      <w:r>
-        <w:rPr>
-          <w:b/>
-        </w:rPr>
-        <w:t xml:space="preserve">Meu perfil</w:t>
-      </w:r>
-    </w:p>
-    <w:p>
-      <w:pPr>
-        <w:ind w:left="397" w:hanging="397"/>
-        <w:spacing w:after="80"/>
-      </w:pPr>
-      <w:r>
-        <w:t xml:space="preserve">26.	Clique na sua foto → </w:t>
-      </w:r>
-      <w:r>
-        <w:rPr>
-          <w:b/>
-        </w:rPr>
-        <w:t xml:space="preserve">Meu perfil</w:t>
-      </w:r>
-      <w:r>
-        <w:t xml:space="preserve">. Troque o seu </w:t>
-      </w:r>
-      <w:r>
-        <w:rPr>
-          <w:b/>
-        </w:rPr>
-        <w:t xml:space="preserve">nome de exibição</w:t>
-      </w:r>
-      <w:r>
-        <w:t xml:space="preserve"> em "Como você quer ser chamado" e clique em </w:t>
-      </w:r>
-      <w:r>
-        <w:rPr>
-          <w:b/>
-        </w:rPr>
-        <w:t xml:space="preserve">Gravar nome</w:t>
-      </w:r>
-      <w:r>
-        <w:t xml:space="preserve">.</w:t>
-      </w:r>
-    </w:p>
-    <w:p>
-      <w:pPr>
-        <w:ind w:left="397" w:hanging="397"/>
-        <w:spacing w:after="80"/>
-      </w:pPr>
-      <w:r>
-        <w:t xml:space="preserve">27.	Clique em </w:t>
-      </w:r>
-      <w:r>
-        <w:rPr>
-          <w:b/>
-        </w:rPr>
-        <w:t xml:space="preserve">Enviar foto</w:t>
-      </w:r>
-      <w:r>
-        <w:t xml:space="preserve"> e escolha um arquivo. </w:t>
-      </w:r>
-      <w:r>
-        <w:rPr>
-          <w:b/>
-        </w:rPr>
-        <w:t xml:space="preserve">Escolher o arquivo já envia</w:t>
-      </w:r>
-      <w:r>
-        <w:t xml:space="preserve"> — não há segundo botão. A foto precisa ser </w:t>
-      </w:r>
-      <w:r>
-        <w:rPr>
-          <w:b/>
-        </w:rPr>
-        <w:t xml:space="preserve">JPG ou PNG, de até 2 MB</w:t>
-      </w:r>
-      <w:r>
-        <w:t xml:space="preserve">.</w:t>
-      </w:r>
-    </w:p>
-    <w:p>
-      <w:pPr>
-        <w:ind w:left="397" w:hanging="397"/>
-        <w:spacing w:after="80"/>
-      </w:pPr>
-      <w:r>
-        <w:t xml:space="preserve">28.	Confira que </w:t>
-      </w:r>
-      <w:r>
-        <w:rPr>
-          <w:b/>
-        </w:rPr>
-        <w:t xml:space="preserve">E-mail</w:t>
-      </w:r>
-      <w:r>
-        <w:t xml:space="preserve"> e </w:t>
-      </w:r>
-      <w:r>
-        <w:rPr>
-          <w:b/>
-        </w:rPr>
-        <w:t xml:space="preserve">Perfil</w:t>
-      </w:r>
-      <w:r>
-        <w:t xml:space="preserve"> aparecem só para leitura, com a razão escrita embaixo.</w:t>
-      </w:r>
-    </w:p>
-    <w:p>
-      <w:r>
-        <w:rPr>
-          <w:b/>
-        </w:rPr>
-        <w:t xml:space="preserve">Administração</w:t>
-      </w:r>
-    </w:p>
-    <w:p>
-      <w:pPr>
-        <w:ind w:left="397" w:hanging="397"/>
-        <w:spacing w:after="80"/>
-      </w:pPr>
-      <w:r>
-        <w:t xml:space="preserve">29.	Clique em </w:t>
-      </w:r>
-      <w:r>
-        <w:rPr>
-          <w:b/>
-        </w:rPr>
-        <w:t xml:space="preserve">Administração</w:t>
-      </w:r>
-      <w:r>
-        <w:t xml:space="preserve">. Você cai em </w:t>
-      </w:r>
-      <w:r>
-        <w:rPr>
-          <w:b/>
-        </w:rPr>
-        <w:t xml:space="preserve">Usuários</w:t>
-      </w:r>
-      <w:r>
-        <w:t xml:space="preserve"> e vê as três abas: </w:t>
-      </w:r>
-      <w:r>
-        <w:rPr>
-          <w:b/>
-        </w:rPr>
-        <w:t xml:space="preserve">Usuários</w:t>
-      </w:r>
-      <w:r>
-        <w:t xml:space="preserve">, </w:t>
+        <w:t xml:space="preserve">Excluir</w:t>
+      </w:r>
+      <w:r>
+        <w:t xml:space="preserve"> (o nome aparece ao passar o mouse).</w:t>
+      </w:r>
+    </w:p>
+    <w:p>
+      <w:pPr>
+        <w:ind w:left="397" w:hanging="397"/>
+        <w:spacing w:after="80"/>
+      </w:pPr>
+      <w:r>
+        <w:t xml:space="preserve">31.	Abra a aba </w:t>
       </w:r>
       <w:r>
         <w:rPr>
@@ -1844,7 +2204,16 @@
         <w:t xml:space="preserve">Permissões</w:t>
       </w:r>
       <w:r>
-        <w:t xml:space="preserve"> e </w:t>
+        <w:t xml:space="preserve">: é a tabela que mostra, perfil por perfil, o que cada um pode fazer. É só leitura, e serve para você conferir por que alguém não vê um botão.</w:t>
+      </w:r>
+    </w:p>
+    <w:p>
+      <w:pPr>
+        <w:ind w:left="397" w:hanging="397"/>
+        <w:spacing w:after="80"/>
+      </w:pPr>
+      <w:r>
+        <w:t xml:space="preserve">32.	Abra a aba </w:t>
       </w:r>
       <w:r>
         <w:rPr>
@@ -1853,97 +2222,16 @@
         <w:t xml:space="preserve">Salas</w:t>
       </w:r>
       <w:r>
-        <w:t xml:space="preserve">.</w:t>
-      </w:r>
-    </w:p>
-    <w:p>
-      <w:pPr>
-        <w:ind w:left="397" w:hanging="397"/>
-        <w:spacing w:after="80"/>
-      </w:pPr>
-      <w:r>
-        <w:t xml:space="preserve">30.	Em </w:t>
-      </w:r>
-      <w:r>
-        <w:rPr>
-          <w:b/>
-        </w:rPr>
-        <w:t xml:space="preserve">Usuários</w:t>
-      </w:r>
-      <w:r>
-        <w:t xml:space="preserve">, confira a lista e as quatro ações de cada linha: </w:t>
-      </w:r>
-      <w:r>
-        <w:rPr>
-          <w:b/>
-        </w:rPr>
-        <w:t xml:space="preserve">Editar</w:t>
-      </w:r>
-      <w:r>
-        <w:t xml:space="preserve">, </w:t>
-      </w:r>
-      <w:r>
-        <w:rPr>
-          <w:b/>
-        </w:rPr>
-        <w:t xml:space="preserve">Redefinir senha</w:t>
-      </w:r>
-      <w:r>
-        <w:t xml:space="preserve">, </w:t>
-      </w:r>
-      <w:r>
-        <w:rPr>
-          <w:b/>
-        </w:rPr>
-        <w:t xml:space="preserve">Desativar</w:t>
-      </w:r>
-      <w:r>
-        <w:t xml:space="preserve"> e </w:t>
-      </w:r>
-      <w:r>
-        <w:rPr>
-          <w:b/>
-        </w:rPr>
-        <w:t xml:space="preserve">Excluir</w:t>
-      </w:r>
-      <w:r>
-        <w:t xml:space="preserve">.</w:t>
-      </w:r>
-    </w:p>
-    <w:p>
-      <w:pPr>
-        <w:ind w:left="397" w:hanging="397"/>
-        <w:spacing w:after="80"/>
-      </w:pPr>
-      <w:r>
-        <w:t xml:space="preserve">31.	Abra a aba </w:t>
-      </w:r>
-      <w:r>
-        <w:rPr>
-          <w:b/>
-        </w:rPr>
-        <w:t xml:space="preserve">Permissões</w:t>
-      </w:r>
-      <w:r>
-        <w:t xml:space="preserve">: é a tabela que mostra, perfil por perfil, o que cada um pode fazer. É só leitura, e serve para você conferir por que alguém não vê um botão.</w:t>
-      </w:r>
-    </w:p>
-    <w:p>
-      <w:pPr>
-        <w:ind w:left="397" w:hanging="397"/>
-        <w:spacing w:after="80"/>
-      </w:pPr>
-      <w:r>
-        <w:t xml:space="preserve">32.	Abra a aba </w:t>
-      </w:r>
-      <w:r>
-        <w:rPr>
-          <w:b/>
-        </w:rPr>
-        <w:t xml:space="preserve">Salas</w:t>
-      </w:r>
-      <w:r>
-        <w:t xml:space="preserve"> e acrescente uma sala de verdade, se houver uma faltando. Sala errada se </w:t>
+        <w:t xml:space="preserve"> e acrescente uma sala de verdade, se houver uma faltando, pelo ícone </w:t>
+      </w:r>
+      <w:r>
+        <w:rPr>
+          <w:b/>
+        </w:rPr>
+        <w:t xml:space="preserve">+</w:t>
+      </w:r>
+      <w:r>
+        <w:t xml:space="preserve"> do alto da página. Sala errada se </w:t>
       </w:r>
       <w:r>
         <w:rPr>
@@ -2168,6 +2456,24 @@
         <w:t xml:space="preserve">Editar curso → Registrar nova vigência</w:t>
       </w:r>
       <w:r>
+        <w:t xml:space="preserve">, e os </w:t>
+      </w:r>
+      <w:r>
+        <w:rPr>
+          <w:b/>
+        </w:rPr>
+        <w:t xml:space="preserve">regimes de horário</w:t>
+      </w:r>
+      <w:r>
+        <w:t xml:space="preserve"> do currículo em </w:t>
+      </w:r>
+      <w:r>
+        <w:rPr>
+          <w:b/>
+        </w:rPr>
+        <w:t xml:space="preserve">Editar curso → Horários</w:t>
+      </w:r>
+      <w:r>
         <w:t xml:space="preserve">.</w:t>
       </w:r>
     </w:p>
@@ -2210,7 +2516,7 @@
         <w:rPr>
           <w:b/>
         </w:rPr>
-        <w:t xml:space="preserve">Grade</w:t>
+        <w:t xml:space="preserve">Turmas</w:t>
       </w:r>
       <w:r>
         <w:t xml:space="preserve"> da página do curso. A turma nasce sempre dentro de um curso.</w:t>
@@ -2249,7 +2555,7 @@
         <w:t xml:space="preserve">unidades de ensino</w:t>
       </w:r>
       <w:r>
-        <w:t xml:space="preserve"> dela.</w:t>
+        <w:t xml:space="preserve"> dela, pela página da disciplina (passo 21).</w:t>
       </w:r>
     </w:p>
     <w:p>
@@ -2922,7 +3228,7 @@
         <w:rPr>
           <w:b/>
         </w:rPr>
-        <w:t xml:space="preserve">Grade</w:t>
+        <w:t xml:space="preserve">Turmas</w:t>
       </w:r>
       <w:r>
         <w:t xml:space="preserve"> → botão </w:t>
@@ -2969,22 +3275,13 @@
         <w:t xml:space="preserve">vai</w:t>
       </w:r>
       <w:r>
-        <w:t xml:space="preserve"> conseguir abrir — e vai encontrar </w:t>
-      </w:r>
-      <w:r>
-        <w:rPr>
-          <w:b/>
-        </w:rPr>
-        <w:t xml:space="preserve">só</w:t>
-      </w:r>
-      <w:r>
-        <w:t xml:space="preserve"> a parte do regime de horário, com a frase </w:t>
-      </w:r>
-      <w:r>
-        <w:rPr>
-          <w:b/>
-        </w:rPr>
-        <w:t xml:space="preserve">"O seu perfil registra o regime deste curso, mas não edita o cadastro dele."</w:t>
+        <w:t xml:space="preserve"> conseguir abrir — e vai encontrar o regime de horário e o conteúdo do currículo, mas não o cadastro do curso, com a frase </w:t>
+      </w:r>
+      <w:r>
+        <w:rPr>
+          <w:b/>
+        </w:rPr>
+        <w:t xml:space="preserve">"O seu perfil registra o regime e edita o conteúdo do currículo deste curso, mas não edita o cadastro dele."</w:t>
       </w:r>
       <w:r>
         <w:t xml:space="preserve"> Isso é esperado.</w:t>
@@ -3031,13 +3328,22 @@
         <w:t xml:space="preserve">Cursos</w:t>
       </w:r>
       <w:r>
-        <w:t xml:space="preserve"> → um curso → aba </w:t>
-      </w:r>
-      <w:r>
-        <w:rPr>
-          <w:b/>
-        </w:rPr>
-        <w:t xml:space="preserve">Disciplinas</w:t>
+        <w:t xml:space="preserve"> → um curso → </w:t>
+      </w:r>
+      <w:r>
+        <w:rPr>
+          <w:b/>
+        </w:rPr>
+        <w:t xml:space="preserve">Editar curso</w:t>
+      </w:r>
+      <w:r>
+        <w:t xml:space="preserve"> → </w:t>
+      </w:r>
+      <w:r>
+        <w:rPr>
+          <w:b/>
+        </w:rPr>
+        <w:t xml:space="preserve">Disciplinas e avaliações</w:t>
       </w:r>
       <w:r>
         <w:t xml:space="preserve">, e abra uma linha.</w:t>
@@ -3049,16 +3355,16 @@
         <w:spacing w:after="80"/>
       </w:pPr>
       <w:r>
-        <w:t xml:space="preserve">11.	Clique em </w:t>
-      </w:r>
-      <w:r>
-        <w:rPr>
-          <w:b/>
-        </w:rPr>
-        <w:t xml:space="preserve">Editar disciplina</w:t>
-      </w:r>
-      <w:r>
-        <w:t xml:space="preserve">, corrija um dado e salve.</w:t>
+        <w:t xml:space="preserve">11.	Clique no </w:t>
+      </w:r>
+      <w:r>
+        <w:rPr>
+          <w:b/>
+        </w:rPr>
+        <w:t xml:space="preserve">lápis</w:t>
+      </w:r>
+      <w:r>
+        <w:t xml:space="preserve"> (*Editar disciplina*): abre a página da disciplina. Corrija um dado e salve.</w:t>
       </w:r>
     </w:p>
     <w:p>
@@ -3076,16 +3382,16 @@
         <w:t xml:space="preserve">ficha de uma turma</w:t>
       </w:r>
       <w:r>
-        <w:t xml:space="preserve">, na seção Disciplinas, abra uma linha e use </w:t>
-      </w:r>
-      <w:r>
-        <w:rPr>
-          <w:b/>
-        </w:rPr>
-        <w:t xml:space="preserve">Gravar período</w:t>
-      </w:r>
-      <w:r>
-        <w:t xml:space="preserve"> e os botões de </w:t>
+        <w:t xml:space="preserve">, na seção Disciplinas, abra uma linha e use os </w:t>
+      </w:r>
+      <w:r>
+        <w:rPr>
+          <w:b/>
+        </w:rPr>
+        <w:t xml:space="preserve">lápis</w:t>
+      </w:r>
+      <w:r>
+        <w:t xml:space="preserve"> do período e dos </w:t>
       </w:r>
       <w:r>
         <w:rPr>
@@ -3094,7 +3400,7 @@
         <w:t xml:space="preserve">instrutores</w:t>
       </w:r>
       <w:r>
-        <w:t xml:space="preserve"> daquela disciplina naquela turma.</w:t>
+        <w:t xml:space="preserve"> daquela disciplina naquela turma — cada um abre uma janela.</w:t>
       </w:r>
     </w:p>
     <w:p>

</xml_diff>

<commit_message>
docs(BLOCO-7): itens 7 a 11 — emendas, guia de testes, roteiro e plano
Emendas registradas: documento 23 §7 (pizza sem teto; o .docx não recebeu), FR-007.2 e Q-11 da spec 016, FR-016 da spec 006. A spec 022 ganha a seção da conferência (A-5, A-6, D-22 a D-30, FR-007 a FR-011, SC-006, SC-007) e as tarefas T020 a T026; o guia de testes e o .docx gerado dele descrevem os itens.

Co-Authored-By: Claude Opus 5.5 <noreply@anthropic.com>
Claude-Session: https://claude.ai/code/session_01MD3GBaCjFj5U9HKH98W1Z1
</commit_message>
<xml_diff>
--- a/docs/testes/guia-de-testes.docx
+++ b/docs/testes/guia-de-testes.docx
@@ -1291,7 +1291,34 @@
         <w:t xml:space="preserve">Cursos</w:t>
       </w:r>
       <w:r>
-        <w:t xml:space="preserve">. Os cursos aparecem agrupados por classificação, com dois quadros de números e dois gráficos.</w:t>
+        <w:t xml:space="preserve">. Os cursos aparecem agrupados por classificação. Clique em </w:t>
+      </w:r>
+      <w:r>
+        <w:rPr>
+          <w:b/>
+        </w:rPr>
+        <w:t xml:space="preserve">Exibir estatísticas</w:t>
+      </w:r>
+      <w:r>
+        <w:t xml:space="preserve">: dois números e dois gráficos — os </w:t>
+      </w:r>
+      <w:r>
+        <w:rPr>
+          <w:b/>
+        </w:rPr>
+        <w:t xml:space="preserve">cursos por classificação</w:t>
+      </w:r>
+      <w:r>
+        <w:t xml:space="preserve"> e a </w:t>
+      </w:r>
+      <w:r>
+        <w:rPr>
+          <w:b/>
+        </w:rPr>
+        <w:t xml:space="preserve">duração em semanas de cada curso e estágio</w:t>
+      </w:r>
+      <w:r>
+        <w:t xml:space="preserve"> (o curso sem a duração em semanas aparece escrito embaixo, e não como barra zero).</w:t>
       </w:r>
     </w:p>
     <w:p>
@@ -1471,7 +1498,34 @@
         <w:t xml:space="preserve">Editar curso</w:t>
       </w:r>
       <w:r>
-        <w:t xml:space="preserve">, mude o </w:t>
+        <w:t xml:space="preserve">. Os campos estão em três grupos: </w:t>
+      </w:r>
+      <w:r>
+        <w:rPr>
+          <w:b/>
+        </w:rPr>
+        <w:t xml:space="preserve">Identidade do curso</w:t>
+      </w:r>
+      <w:r>
+        <w:t xml:space="preserve"> (sigla, nome, classificação, modalidade), </w:t>
+      </w:r>
+      <w:r>
+        <w:rPr>
+          <w:b/>
+        </w:rPr>
+        <w:t xml:space="preserve">Oferta e custo</w:t>
+      </w:r>
+      <w:r>
+        <w:t xml:space="preserve"> (limite de turmas por ano, estrangeiros e custo) e </w:t>
+      </w:r>
+      <w:r>
+        <w:rPr>
+          <w:b/>
+        </w:rPr>
+        <w:t xml:space="preserve">Currículo e suas partes</w:t>
+      </w:r>
+      <w:r>
+        <w:t xml:space="preserve">. Mude o </w:t>
       </w:r>
       <w:r>
         <w:rPr>
@@ -1480,6 +1534,15 @@
         <w:t xml:space="preserve">propósito</w:t>
       </w:r>
       <w:r>
+        <w:t xml:space="preserve"> em *Currículo e suas partes* → </w:t>
+      </w:r>
+      <w:r>
+        <w:rPr>
+          <w:b/>
+        </w:rPr>
+        <w:t xml:space="preserve">Dados e PDF</w:t>
+      </w:r>
+      <w:r>
         <w:t xml:space="preserve"> e salve. Deve aparecer confirmação. Se você mudar a sigla, a classificação ou o limite de turmas, o sistema </w:t>
       </w:r>
       <w:r>
@@ -1918,7 +1981,16 @@
         <w:spacing w:after="80"/>
       </w:pPr>
       <w:r>
-        <w:t xml:space="preserve">24.	Abra a ficha de um instrutor. Os alertas dele (carga fora da faixa, capacitação vencida) estão no </w:t>
+        <w:t xml:space="preserve">24.	Abra a ficha de um instrutor. Os alertas dele (carga </w:t>
+      </w:r>
+      <w:r>
+        <w:rPr>
+          <w:b/>
+        </w:rPr>
+        <w:t xml:space="preserve">acima</w:t>
+      </w:r>
+      <w:r>
+        <w:t xml:space="preserve"> da faixa do regime, capacitação vencida) estão no </w:t>
       </w:r>
       <w:r>
         <w:rPr>
@@ -1936,7 +2008,16 @@
         <w:t xml:space="preserve">avisam, não impedem nada</w:t>
       </w:r>
       <w:r>
-        <w:t xml:space="preserve">.</w:t>
+        <w:t xml:space="preserve">. Carga </w:t>
+      </w:r>
+      <w:r>
+        <w:rPr>
+          <w:b/>
+        </w:rPr>
+        <w:t xml:space="preserve">abaixo</w:t>
+      </w:r>
+      <w:r>
+        <w:t xml:space="preserve"> da faixa não avisa.</w:t>
       </w:r>
     </w:p>
     <w:p>
@@ -2447,16 +2528,7 @@
         <w:t xml:space="preserve">Editar curso</w:t>
       </w:r>
       <w:r>
-        <w:t xml:space="preserve">, inclusive registrar uma vigência nova de regime de horário em </w:t>
-      </w:r>
-      <w:r>
-        <w:rPr>
-          <w:b/>
-        </w:rPr>
-        <w:t xml:space="preserve">Editar curso → Registrar nova vigência</w:t>
-      </w:r>
-      <w:r>
-        <w:t xml:space="preserve">, e os </w:t>
+        <w:t xml:space="preserve">, inclusive os </w:t>
       </w:r>
       <w:r>
         <w:rPr>
@@ -2465,7 +2537,7 @@
         <w:t xml:space="preserve">regimes de horário</w:t>
       </w:r>
       <w:r>
-        <w:t xml:space="preserve"> do currículo em </w:t>
+        <w:t xml:space="preserve"> do currículo e a vigência nova do regime de horário do curso, os dois em </w:t>
       </w:r>
       <w:r>
         <w:rPr>
@@ -2474,7 +2546,7 @@
         <w:t xml:space="preserve">Editar curso → Horários</w:t>
       </w:r>
       <w:r>
-        <w:t xml:space="preserve">.</w:t>
+        <w:t xml:space="preserve"> (*Registrar nova vigência*).</w:t>
       </w:r>
     </w:p>
     <w:p>
@@ -3294,6 +3366,15 @@
       </w:pPr>
       <w:r>
         <w:t xml:space="preserve">9.	Em </w:t>
+      </w:r>
+      <w:r>
+        <w:rPr>
+          <w:b/>
+        </w:rPr>
+        <w:t xml:space="preserve">Horários</w:t>
+      </w:r>
+      <w:r>
+        <w:t xml:space="preserve"> → </w:t>
       </w:r>
       <w:r>
         <w:rPr>

</xml_diff>